<commit_message>
Getting through section 3
and updated summary
</commit_message>
<xml_diff>
--- a/Summary and Division of Labor.docx
+++ b/Summary and Division of Labor.docx
@@ -2,6 +2,72 @@
 <file path=word/document.xml><?xml version="1.0" encoding="utf-8"?>
 <w:document xmlns:wpc="http://schemas.microsoft.com/office/word/2010/wordprocessingCanvas" xmlns:cx="http://schemas.microsoft.com/office/drawing/2014/chartex" xmlns:cx1="http://schemas.microsoft.com/office/drawing/2015/9/8/chartex" xmlns:cx2="http://schemas.microsoft.com/office/drawing/2015/10/21/chartex" xmlns:cx3="http://schemas.microsoft.com/office/drawing/2016/5/9/chartex" xmlns:cx4="http://schemas.microsoft.com/office/drawing/2016/5/10/chartex" xmlns:cx5="http://schemas.microsoft.com/office/drawing/2016/5/11/chartex" xmlns:cx6="http://schemas.microsoft.com/office/drawing/2016/5/12/chartex" xmlns:cx7="http://schemas.microsoft.com/office/drawing/2016/5/13/chartex" xmlns:cx8="http://schemas.microsoft.com/office/drawing/2016/5/14/chartex" xmlns:mc="http://schemas.openxmlformats.org/markup-compatibility/2006" xmlns:aink="http://schemas.microsoft.com/office/drawing/2016/ink" xmlns:am3d="http://schemas.microsoft.com/office/drawing/2017/model3d" xmlns:o="urn:schemas-microsoft-com:office:office" xmlns:oel="http://schemas.microsoft.com/office/2019/extlst" xmlns:r="http://schemas.openxmlformats.org/officeDocument/2006/relationships" xmlns:m="http://schemas.openxmlformats.org/officeDocument/2006/math" xmlns:v="urn:schemas-microsoft-com:vml" xmlns:wp14="http://schemas.microsoft.com/office/word/2010/wordprocessingDrawing" xmlns:wp="http://schemas.openxmlformats.org/drawingml/2006/wordprocessingDrawing" xmlns:w10="urn:schemas-microsoft-com:office:word" xmlns:w="http://schemas.openxmlformats.org/wordprocessingml/2006/main" xmlns:w14="http://schemas.microsoft.com/office/word/2010/wordml" xmlns:w15="http://schemas.microsoft.com/office/word/2012/wordml" xmlns:w16cex="http://schemas.microsoft.com/office/word/2018/wordml/cex" xmlns:w16cid="http://schemas.microsoft.com/office/word/2016/wordml/cid" xmlns:w16="http://schemas.microsoft.com/office/word/2018/wordml" xmlns:w16du="http://schemas.microsoft.com/office/word/2023/wordml/word16du" xmlns:w16sdtdh="http://schemas.microsoft.com/office/word/2020/wordml/sdtdatahash" xmlns:w16sdtfl="http://schemas.microsoft.com/office/word/2024/wordml/sdtformatlock" xmlns:w16se="http://schemas.microsoft.com/office/word/2015/wordml/symex" xmlns:wpg="http://schemas.microsoft.com/office/word/2010/wordprocessingGroup" xmlns:wpi="http://schemas.microsoft.com/office/word/2010/wordprocessingInk" xmlns:wne="http://schemas.microsoft.com/office/word/2006/wordml" xmlns:wps="http://schemas.microsoft.com/office/word/2010/wordprocessingShape" mc:Ignorable="w14 w15 w16se w16cid w16 w16cex w16sdtdh w16sdtfl w16du wp14">
   <w:body>
+    <w:p>
+      <w:pPr>
+        <w:spacing w:after="0"/>
+        <w:ind w:left="720" w:hanging="360"/>
+      </w:pPr>
+      <w:r>
+        <w:rPr>
+          <w:highlight w:val="yellow"/>
+        </w:rPr>
+        <w:t>Person 1</w:t>
+      </w:r>
+    </w:p>
+    <w:p>
+      <w:pPr>
+        <w:spacing w:after="0"/>
+        <w:ind w:left="720" w:hanging="360"/>
+      </w:pPr>
+      <w:r>
+        <w:rPr>
+          <w:highlight w:val="green"/>
+        </w:rPr>
+        <w:t>Person 2</w:t>
+      </w:r>
+    </w:p>
+    <w:p>
+      <w:pPr>
+        <w:spacing w:after="0"/>
+        <w:ind w:left="720" w:hanging="360"/>
+      </w:pPr>
+      <w:r>
+        <w:rPr>
+          <w:highlight w:val="cyan"/>
+        </w:rPr>
+        <w:t>Person 3</w:t>
+      </w:r>
+    </w:p>
+    <w:p>
+      <w:pPr>
+        <w:spacing w:after="0"/>
+        <w:ind w:left="720" w:hanging="360"/>
+      </w:pPr>
+      <w:r>
+        <w:rPr>
+          <w:highlight w:val="magenta"/>
+        </w:rPr>
+        <w:t>Person 4</w:t>
+      </w:r>
+    </w:p>
+    <w:p>
+      <w:pPr>
+        <w:spacing w:after="0"/>
+        <w:ind w:left="720" w:hanging="360"/>
+      </w:pPr>
+      <w:r>
+        <w:rPr>
+          <w:highlight w:val="red"/>
+        </w:rPr>
+        <w:t>Everyone</w:t>
+      </w:r>
+    </w:p>
+    <w:p>
+      <w:pPr>
+        <w:spacing w:after="0"/>
+        <w:ind w:left="720" w:hanging="360"/>
+      </w:pPr>
+    </w:p>
     <w:p>
       <w:pPr>
         <w:pStyle w:val="ListParagraph"/>
@@ -9,6 +75,7 @@
           <w:ilvl w:val="0"/>
           <w:numId w:val="1"/>
         </w:numPr>
+        <w:spacing w:after="0"/>
         <w:rPr>
           <w:u w:val="single"/>
         </w:rPr>
@@ -17,7 +84,7 @@
         <w:rPr>
           <w:u w:val="single"/>
         </w:rPr>
-        <w:t>Is Done</w:t>
+        <w:t>Completed</w:t>
       </w:r>
     </w:p>
     <w:p>
@@ -27,6 +94,7 @@
           <w:ilvl w:val="0"/>
           <w:numId w:val="1"/>
         </w:numPr>
+        <w:spacing w:after="0"/>
         <w:rPr>
           <w:u w:val="single"/>
         </w:rPr>
@@ -35,7 +103,19 @@
         <w:rPr>
           <w:u w:val="single"/>
         </w:rPr>
-        <w:t>Requires understanding of Missing Data</w:t>
+        <w:t>Not ready to complete yet-</w:t>
+      </w:r>
+      <w:r>
+        <w:rPr>
+          <w:u w:val="single"/>
+        </w:rPr>
+        <w:t xml:space="preserve">Added random zip codes to </w:t>
+      </w:r>
+      <w:r>
+        <w:rPr>
+          <w:u w:val="single"/>
+        </w:rPr>
+        <w:t>allow us to continue</w:t>
       </w:r>
     </w:p>
     <w:p>
@@ -45,6 +125,7 @@
           <w:ilvl w:val="0"/>
           <w:numId w:val="1"/>
         </w:numPr>
+        <w:spacing w:after="0"/>
         <w:rPr>
           <w:u w:val="single"/>
         </w:rPr>
@@ -53,7 +134,19 @@
         <w:rPr>
           <w:u w:val="single"/>
         </w:rPr>
-        <w:t>Is Dependent on 2</w:t>
+        <w:t>Completed (will require</w:t>
+      </w:r>
+      <w:r>
+        <w:rPr>
+          <w:u w:val="single"/>
+        </w:rPr>
+        <w:t xml:space="preserve"> checking after completing 2</w:t>
+      </w:r>
+      <w:r>
+        <w:rPr>
+          <w:u w:val="single"/>
+        </w:rPr>
+        <w:t>)</w:t>
       </w:r>
     </w:p>
     <w:p>
@@ -63,6 +156,7 @@
           <w:ilvl w:val="0"/>
           <w:numId w:val="1"/>
         </w:numPr>
+        <w:spacing w:after="0"/>
         <w:rPr>
           <w:highlight w:val="yellow"/>
         </w:rPr>
@@ -81,6 +175,7 @@
           <w:ilvl w:val="0"/>
           <w:numId w:val="1"/>
         </w:numPr>
+        <w:spacing w:after="0"/>
         <w:rPr>
           <w:highlight w:val="green"/>
         </w:rPr>
@@ -99,6 +194,7 @@
           <w:ilvl w:val="0"/>
           <w:numId w:val="1"/>
         </w:numPr>
+        <w:spacing w:after="0"/>
         <w:rPr>
           <w:highlight w:val="cyan"/>
         </w:rPr>
@@ -117,6 +213,7 @@
           <w:ilvl w:val="0"/>
           <w:numId w:val="1"/>
         </w:numPr>
+        <w:spacing w:after="0"/>
         <w:rPr>
           <w:highlight w:val="magenta"/>
         </w:rPr>
@@ -135,6 +232,7 @@
           <w:ilvl w:val="0"/>
           <w:numId w:val="1"/>
         </w:numPr>
+        <w:spacing w:after="0"/>
         <w:rPr>
           <w:highlight w:val="yellow"/>
         </w:rPr>
@@ -153,6 +251,7 @@
           <w:ilvl w:val="0"/>
           <w:numId w:val="1"/>
         </w:numPr>
+        <w:spacing w:after="0"/>
         <w:rPr>
           <w:highlight w:val="green"/>
         </w:rPr>
@@ -171,6 +270,7 @@
           <w:ilvl w:val="0"/>
           <w:numId w:val="1"/>
         </w:numPr>
+        <w:spacing w:after="0"/>
         <w:rPr>
           <w:highlight w:val="cyan"/>
         </w:rPr>
@@ -189,6 +289,7 @@
           <w:ilvl w:val="0"/>
           <w:numId w:val="1"/>
         </w:numPr>
+        <w:spacing w:after="0"/>
         <w:rPr>
           <w:highlight w:val="magenta"/>
         </w:rPr>
@@ -207,6 +308,7 @@
           <w:ilvl w:val="0"/>
           <w:numId w:val="1"/>
         </w:numPr>
+        <w:spacing w:after="0"/>
         <w:rPr>
           <w:highlight w:val="red"/>
         </w:rPr>
@@ -225,6 +327,7 @@
           <w:ilvl w:val="0"/>
           <w:numId w:val="1"/>
         </w:numPr>
+        <w:spacing w:after="0"/>
         <w:rPr>
           <w:highlight w:val="red"/>
         </w:rPr>
@@ -243,6 +346,7 @@
           <w:ilvl w:val="0"/>
           <w:numId w:val="1"/>
         </w:numPr>
+        <w:spacing w:after="0"/>
         <w:rPr>
           <w:highlight w:val="red"/>
         </w:rPr>
@@ -261,6 +365,7 @@
           <w:ilvl w:val="0"/>
           <w:numId w:val="1"/>
         </w:numPr>
+        <w:spacing w:after="0"/>
         <w:rPr>
           <w:highlight w:val="red"/>
         </w:rPr>
@@ -279,6 +384,7 @@
           <w:ilvl w:val="0"/>
           <w:numId w:val="1"/>
         </w:numPr>
+        <w:spacing w:after="0"/>
         <w:rPr>
           <w:highlight w:val="red"/>
         </w:rPr>
@@ -292,11 +398,13 @@
     </w:p>
     <w:p>
       <w:pPr>
+        <w:spacing w:after="0"/>
         <w:ind w:left="360"/>
       </w:pPr>
     </w:p>
     <w:p>
       <w:pPr>
+        <w:spacing w:after="0"/>
         <w:ind w:left="360"/>
       </w:pPr>
     </w:p>

</xml_diff>

<commit_message>
Update Summary and Division of Labor.docx
</commit_message>
<xml_diff>
--- a/Summary and Division of Labor.docx
+++ b/Summary and Division of Labor.docx
@@ -11,7 +11,7 @@
         <w:rPr>
           <w:highlight w:val="yellow"/>
         </w:rPr>
-        <w:t>Person 1</w:t>
+        <w:t>Alan</w:t>
       </w:r>
     </w:p>
     <w:p>
@@ -23,7 +23,7 @@
         <w:rPr>
           <w:highlight w:val="green"/>
         </w:rPr>
-        <w:t>Person 2</w:t>
+        <w:t>Adri</w:t>
       </w:r>
     </w:p>
     <w:p>
@@ -35,7 +35,7 @@
         <w:rPr>
           <w:highlight w:val="cyan"/>
         </w:rPr>
-        <w:t>Person 3</w:t>
+        <w:t>Matt</w:t>
       </w:r>
     </w:p>
     <w:p>
@@ -47,7 +47,7 @@
         <w:rPr>
           <w:highlight w:val="magenta"/>
         </w:rPr>
-        <w:t>Person 4</w:t>
+        <w:t>Daniel</w:t>
       </w:r>
     </w:p>
     <w:p>

</xml_diff>